<commit_message>
docs(TRB): cahier ProConcept — un fichier = un lot de commandes (multi-CCI)
Précise qu'un fichier d'import contient un lot de plusieurs commandes (pas un
fichier par commande) ; regroupement des lignes par Clé 1 + référence partenaire ;
exemple mis à jour avec 2 commandes -> 2 CCI dans un seul fichier.

Co-Authored-By: Claude Opus 4.8 (1M context) <noreply@anthropic.com>
</commit_message>
<xml_diff>
--- a/DOCUMENTATIONpourTRB/Cahier_des_charges_ProConcept.docx
+++ b/DOCUMENTATIONpourTRB/Cahier_des_charges_ProConcept.docx
@@ -350,7 +350,7 @@
           <w:b w:val="0"/>
           <w:i w:val="0"/>
         </w:rPr>
-        <w:t>Une CCI correspond à une commande client : un en-tête (le client et ses références) et une ou plusieurs lignes (article + quantité). Nous pouvons produire ces champs dans l'ordre, avec les intitulés et le format que vous préciserez dans votre gabarit.</w:t>
+        <w:t>Un fichier d'import correspond à un lot : il regroupe plusieurs commandes. Chaque commande (CCI) a un en-tête (le client et ses références) et une ou plusieurs lignes (article + quantité). Nous pouvons produire ces champs dans l'ordre, avec les intitulés et le format que vous préciserez dans votre gabarit.</w:t>
       </w:r>
     </w:p>
     <w:p>
@@ -802,6 +802,53 @@
         <w:spacing w:after="40"/>
       </w:pPr>
     </w:p>
+    <w:tbl>
+      <w:tblPr>
+        <w:tblW w:type="auto" w:w="0"/>
+        <w:jc w:val="center"/>
+        <w:tblLook w:firstColumn="1" w:firstRow="1" w:lastColumn="0" w:lastRow="0" w:noHBand="0" w:noVBand="1" w:val="04A0"/>
+        <w:tblBorders>
+          <w:top w:val="single" w:sz="6" w:space="0" w:color="C55A11"/>
+          <w:left w:val="single" w:sz="6" w:space="0" w:color="C55A11"/>
+          <w:bottom w:val="single" w:sz="6" w:space="0" w:color="C55A11"/>
+          <w:right w:val="single" w:sz="6" w:space="0" w:color="C55A11"/>
+          <w:insideH w:val="single" w:sz="6" w:space="0" w:color="C55A11"/>
+          <w:insideV w:val="single" w:sz="6" w:space="0" w:color="C55A11"/>
+        </w:tblBorders>
+      </w:tblPr>
+      <w:tblGrid>
+        <w:gridCol w:w="9648"/>
+      </w:tblGrid>
+      <w:tr>
+        <w:tc>
+          <w:tcPr>
+            <w:tcW w:type="dxa" w:w="9648"/>
+            <w:shd w:val="clear" w:color="auto" w:fill="FCE4D6"/>
+          </w:tcPr>
+          <w:p>
+            <w:pPr>
+              <w:spacing w:after="40" w:before="40"/>
+            </w:pPr>
+            <w:r/>
+            <w:r>
+              <w:rPr>
+                <w:b/>
+                <w:color w:val="C55A11"/>
+              </w:rPr>
+              <w:t xml:space="preserve">Important :  </w:t>
+            </w:r>
+            <w:r>
+              <w:t>Un fichier d'import = un LOT de plusieurs commandes (pas un fichier par commande). Au sein du lot, les lignes d'une même commande sont regroupées par leur en-tête — nous prévoyons la clé « Clé 1 + référence partenaire ».</w:t>
+            </w:r>
+          </w:p>
+        </w:tc>
+      </w:tr>
+    </w:tbl>
+    <w:p>
+      <w:pPr>
+        <w:spacing w:after="40"/>
+      </w:pPr>
+    </w:p>
     <w:p>
       <w:pPr>
         <w:spacing w:after="100" w:before="0"/>
@@ -813,7 +860,7 @@
           <w:color w:val="595959"/>
           <w:sz w:val="20"/>
         </w:rPr>
-        <w:t>Le nom du client n'est là que pour faciliter le contrôle visuel : il peut être ignoré à l'import. Le format exact (colonnes, ordre, format de date, séparateur décimal, encodage, un fichier par commande ou un fichier par lot regroupant plusieurs commandes) suivra votre gabarit — voir sections 4 et 5.</w:t>
+        <w:t>Le nom du client n'est là que pour faciliter le contrôle visuel : il peut être ignoré à l'import. Le format exact (colonnes, ordre, format de date, séparateur décimal, encodage) suivra votre gabarit — voir sections 4 et 5.</w:t>
       </w:r>
     </w:p>
     <w:p>
@@ -1084,7 +1131,7 @@
         <w:rPr>
           <w:b w:val="0"/>
         </w:rPr>
-        <w:t>Un import correspond-il à une seule commande, ou un fichier peut-il contenir plusieurs commandes (lot) ? Comment les lignes sont-elles rattachées à leur en-tête (clé de regroupement) ?</w:t>
+        <w:t>Un fichier contient un lot de plusieurs commandes : confirmez-vous que ProConcept sait créer plusieurs CCI depuis un seul fichier, et que le regroupement des lignes par « Clé 1 + référence partenaire » vous convient ?</w:t>
       </w:r>
     </w:p>
     <w:p>
@@ -1152,7 +1199,7 @@
           <w:b w:val="0"/>
           <w:i w:val="0"/>
         </w:rPr>
-        <w:t>Une commande de deux articles. La mise en forme exacte (colonnes, ordre, un ou plusieurs fichiers) suivra votre gabarit — cet exemple sert uniquement à illustrer le contenu.</w:t>
+        <w:t>Un seul fichier contenant un lot de deux commandes. La mise en forme exacte (colonnes, ordre) suivra votre gabarit — cet exemple sert uniquement à illustrer le contenu.</w:t>
       </w:r>
     </w:p>
     <w:tbl>
@@ -1453,6 +1500,92 @@
           </w:p>
         </w:tc>
       </w:tr>
+      <w:tr>
+        <w:tc>
+          <w:tcPr>
+            <w:tcW w:type="dxa" w:w="1296"/>
+          </w:tcPr>
+          <w:p>
+            <w:r/>
+            <w:r>
+              <w:rPr>
+                <w:b w:val="0"/>
+              </w:rPr>
+              <w:t>2455301</w:t>
+            </w:r>
+          </w:p>
+        </w:tc>
+        <w:tc>
+          <w:tcPr>
+            <w:tcW w:type="dxa" w:w="2448"/>
+          </w:tcPr>
+          <w:p>
+            <w:r/>
+            <w:r>
+              <w:rPr>
+                <w:b w:val="0"/>
+              </w:rPr>
+              <w:t>Clinique du Lac</w:t>
+            </w:r>
+          </w:p>
+        </w:tc>
+        <w:tc>
+          <w:tcPr>
+            <w:tcW w:type="dxa" w:w="2160"/>
+          </w:tcPr>
+          <w:p>
+            <w:r/>
+            <w:r>
+              <w:rPr>
+                <w:b w:val="0"/>
+              </w:rPr>
+              <w:t>BC-2098</w:t>
+            </w:r>
+          </w:p>
+        </w:tc>
+        <w:tc>
+          <w:tcPr>
+            <w:tcW w:type="dxa" w:w="1872"/>
+          </w:tcPr>
+          <w:p>
+            <w:r/>
+            <w:r>
+              <w:rPr>
+                <w:b w:val="0"/>
+              </w:rPr>
+              <w:t>20/07/2026</w:t>
+            </w:r>
+          </w:p>
+        </w:tc>
+        <w:tc>
+          <w:tcPr>
+            <w:tcW w:type="dxa" w:w="1008"/>
+          </w:tcPr>
+          <w:p>
+            <w:r/>
+            <w:r>
+              <w:rPr>
+                <w:b w:val="0"/>
+              </w:rPr>
+              <w:t>1311</w:t>
+            </w:r>
+          </w:p>
+        </w:tc>
+        <w:tc>
+          <w:tcPr>
+            <w:tcW w:type="dxa" w:w="1152"/>
+          </w:tcPr>
+          <w:p>
+            <w:r/>
+            <w:r>
+              <w:rPr>
+                <w:b w:val="0"/>
+              </w:rPr>
+              <w:t>30</w:t>
+            </w:r>
+          </w:p>
+        </w:tc>
+      </w:tr>
     </w:tbl>
     <w:p>
       <w:pPr>
@@ -1470,7 +1603,7 @@
           <w:color w:val="595959"/>
           <w:sz w:val="20"/>
         </w:rPr>
-        <w:t>Ici, les deux lignes appartiennent à la même commande (même Clé 1 + même référence partenaire) : elles forment une seule CCI à deux lignes.</w:t>
+        <w:t>Ce fichier est un lot de deux commandes : la première (Clé 1 2780008 / réf. CMD-4471) a deux lignes, la seconde (Clé 1 2455301 / réf. BC-2098) en a une. Les lignes sont regroupées en commandes par « Clé 1 + référence partenaire » → ProConcept crée ici deux CCI.</w:t>
       </w:r>
     </w:p>
     <w:sectPr>

</xml_diff>